<commit_message>
feat: make light the primary theme and prepare usability round 1
- Light is the default theme; dark applies when chosen (or System on a
  dark device); theme switch on the landing page until the M4 settings
- Facilitator screen (/facilitator, unlinked, not indexed) resets the
  device and sets up the missed-days and exam-close task states
- pnpm start --prod and usability.bat serve the production build to phones
  on the same Wi-Fi and print the phone and facilitator addresses
- Usability Round 1 Kit v0.1 (script, tasks, observation sheet, SUS,
  triage, consent) and Engineering Plan v0.2 notes for these changes

Co-Authored-By: Claude Opus 5.5 <noreply@anthropic.com>
</commit_message>
<xml_diff>
--- a/docs/MedLearn_OS_Visual_UX_UI_Engineering_Plan_v0_2.docx
+++ b/docs/MedLearn_OS_Visual_UX_UI_Engineering_Plan_v0_2.docx
@@ -854,7 +854,14 @@
               <w:spacing w:after="40"/>
             </w:pPr>
             <w:r>
-              <w:t xml:space="preserve">Bus or train</w:t>
+              <w:rPr>
+                <w:b/>
+                <w:color w:val="B45309"/>
+              </w:rPr>
+              <w:t xml:space="preserve">v0.2 CHANGE  </w:t>
+            </w:r>
+            <w:r>
+              <w:t xml:space="preserve">Hostel room at night (v0.2)</w:t>
             </w:r>
           </w:p>
         </w:tc>
@@ -876,7 +883,7 @@
               <w:spacing w:after="40"/>
             </w:pPr>
             <w:r>
-              <w:t xml:space="preserve">One hand, unstable network</w:t>
+              <w:t xml:space="preserve">Low light, long sessions</w:t>
             </w:r>
           </w:p>
         </w:tc>
@@ -898,7 +905,7 @@
               <w:spacing w:after="40"/>
             </w:pPr>
             <w:r>
-              <w:t xml:space="preserve">Bottom navigation, large targets, offline packs, auto-save of every answer.</w:t>
+              <w:t xml:space="preserve">Light is the primary theme; the night-sky dark theme is one tap away (Dark, or System to follow the phone).</w:t>
             </w:r>
           </w:p>
         </w:tc>
@@ -921,7 +928,7 @@
               <w:spacing w:after="40"/>
             </w:pPr>
             <w:r>
-              <w:t xml:space="preserve">Library</w:t>
+              <w:t xml:space="preserve">Bus or train</w:t>
             </w:r>
           </w:p>
         </w:tc>
@@ -942,7 +949,7 @@
               <w:spacing w:after="40"/>
             </w:pPr>
             <w:r>
-              <w:t xml:space="preserve">Silence, focus</w:t>
+              <w:t xml:space="preserve">One hand, unstable network</w:t>
             </w:r>
           </w:p>
         </w:tc>
@@ -963,7 +970,7 @@
               <w:spacing w:after="40"/>
             </w:pPr>
             <w:r>
-              <w:t xml:space="preserve">No autoplay sound; captions on all audio and video.</w:t>
+              <w:t xml:space="preserve">Bottom navigation, large targets, offline packs, auto-save of every answer.</w:t>
             </w:r>
           </w:p>
         </w:tc>
@@ -987,7 +994,7 @@
               <w:spacing w:after="40"/>
             </w:pPr>
             <w:r>
-              <w:t xml:space="preserve">Before or after the dissection hall</w:t>
+              <w:t xml:space="preserve">Library</w:t>
             </w:r>
           </w:p>
         </w:tc>
@@ -1009,7 +1016,7 @@
               <w:spacing w:after="40"/>
             </w:pPr>
             <w:r>
-              <w:t xml:space="preserve">Short preparation windows</w:t>
+              <w:t xml:space="preserve">Silence, focus</w:t>
             </w:r>
           </w:p>
         </w:tc>
@@ -1031,7 +1038,7 @@
               <w:spacing w:after="40"/>
             </w:pPr>
             <w:r>
-              <w:t xml:space="preserve">“Today’s dissection” card opens in one tap (P1).</w:t>
+              <w:t xml:space="preserve">No autoplay sound; captions on all audio and video.</w:t>
             </w:r>
           </w:p>
         </w:tc>
@@ -1054,7 +1061,7 @@
               <w:spacing w:after="40"/>
             </w:pPr>
             <w:r>
-              <w:t xml:space="preserve">Entry-level Android phone</w:t>
+              <w:t xml:space="preserve">Before or after the dissection hall</w:t>
             </w:r>
           </w:p>
         </w:tc>
@@ -1075,7 +1082,7 @@
               <w:spacing w:after="40"/>
             </w:pPr>
             <w:r>
-              <w:t xml:space="preserve">Limited memory, CPU and storage</w:t>
+              <w:t xml:space="preserve">Short preparation windows</w:t>
             </w:r>
           </w:p>
         </w:tc>
@@ -1096,7 +1103,7 @@
               <w:spacing w:after="40"/>
             </w:pPr>
             <w:r>
-              <w:t xml:space="preserve">Performance budgets (Section 11); SVG and small animations instead of video.</w:t>
+              <w:t xml:space="preserve">“Today’s dissection” card opens in one tap (P1).</w:t>
             </w:r>
           </w:p>
         </w:tc>
@@ -1120,7 +1127,7 @@
               <w:spacing w:after="40"/>
             </w:pPr>
             <w:r>
-              <w:t xml:space="preserve">Limited mobile data</w:t>
+              <w:t xml:space="preserve">Entry-level Android phone</w:t>
             </w:r>
           </w:p>
         </w:tc>
@@ -1142,7 +1149,7 @@
               <w:spacing w:after="40"/>
             </w:pPr>
             <w:r>
-              <w:t xml:space="preserve">Data packs run out</w:t>
+              <w:t xml:space="preserve">Limited memory, CPU and storage</w:t>
             </w:r>
           </w:p>
         </w:tc>
@@ -1164,7 +1171,7 @@
               <w:spacing w:after="40"/>
             </w:pPr>
             <w:r>
-              <w:t xml:space="preserve">Small pages, lazy-loaded media, download-on-Wi-Fi option for offline packs.</w:t>
+              <w:t xml:space="preserve">Performance budgets (Section 11); SVG and small animations instead of video.</w:t>
             </w:r>
           </w:p>
         </w:tc>
@@ -1187,7 +1194,7 @@
               <w:spacing w:after="40"/>
             </w:pPr>
             <w:r>
-              <w:t xml:space="preserve">Laptop or desktop</w:t>
+              <w:t xml:space="preserve">Limited mobile data</w:t>
             </w:r>
           </w:p>
         </w:tc>
@@ -1208,7 +1215,7 @@
               <w:spacing w:after="40"/>
             </w:pPr>
             <w:r>
-              <w:t xml:space="preserve">Longer revision sessions</w:t>
+              <w:t xml:space="preserve">Data packs run out</w:t>
             </w:r>
           </w:p>
         </w:tc>
@@ -1229,7 +1236,7 @@
               <w:spacing w:after="40"/>
             </w:pPr>
             <w:r>
-              <w:t xml:space="preserve">Two-column layouts from tablet width upwards.</w:t>
+              <w:t xml:space="preserve">Small pages, lazy-loaded media, download-on-Wi-Fi option for offline packs.</w:t>
             </w:r>
           </w:p>
         </w:tc>
@@ -1246,6 +1253,73 @@
               <w:right w:val="single" w:sz="4" w:color="D7DEE5"/>
             </w:tcBorders>
             <w:shd w:fill="F4F7F9"/>
+          </w:tcPr>
+          <w:p>
+            <w:pPr>
+              <w:pStyle w:val="TableText"/>
+              <w:spacing w:after="40"/>
+            </w:pPr>
+            <w:r>
+              <w:t xml:space="preserve">Laptop or desktop</w:t>
+            </w:r>
+          </w:p>
+        </w:tc>
+        <w:tc>
+          <w:tcPr>
+            <w:tcW w:type="dxa" w:w="2600"/>
+            <w:vAlign w:val="top"/>
+            <w:tcBorders>
+              <w:top w:val="single" w:sz="4" w:color="D7DEE5"/>
+              <w:left w:val="single" w:sz="4" w:color="D7DEE5"/>
+              <w:bottom w:val="single" w:sz="4" w:color="D7DEE5"/>
+              <w:right w:val="single" w:sz="4" w:color="D7DEE5"/>
+            </w:tcBorders>
+            <w:shd w:fill="F4F7F9"/>
+          </w:tcPr>
+          <w:p>
+            <w:pPr>
+              <w:pStyle w:val="TableText"/>
+              <w:spacing w:after="40"/>
+            </w:pPr>
+            <w:r>
+              <w:t xml:space="preserve">Longer revision sessions</w:t>
+            </w:r>
+          </w:p>
+        </w:tc>
+        <w:tc>
+          <w:tcPr>
+            <w:tcW w:type="dxa" w:w="4880"/>
+            <w:vAlign w:val="top"/>
+            <w:tcBorders>
+              <w:top w:val="single" w:sz="4" w:color="D7DEE5"/>
+              <w:left w:val="single" w:sz="4" w:color="D7DEE5"/>
+              <w:bottom w:val="single" w:sz="4" w:color="D7DEE5"/>
+              <w:right w:val="single" w:sz="4" w:color="D7DEE5"/>
+            </w:tcBorders>
+            <w:shd w:fill="F4F7F9"/>
+          </w:tcPr>
+          <w:p>
+            <w:pPr>
+              <w:pStyle w:val="TableText"/>
+              <w:spacing w:after="40"/>
+            </w:pPr>
+            <w:r>
+              <w:t xml:space="preserve">Two-column layouts from tablet width upwards.</w:t>
+            </w:r>
+          </w:p>
+        </w:tc>
+      </w:tr>
+      <w:tr>
+        <w:tc>
+          <w:tcPr>
+            <w:tcW w:type="dxa" w:w="2600"/>
+            <w:vAlign w:val="top"/>
+            <w:tcBorders>
+              <w:top w:val="single" w:sz="4" w:color="D7DEE5"/>
+              <w:left w:val="single" w:sz="4" w:color="D7DEE5"/>
+              <w:bottom w:val="single" w:sz="4" w:color="D7DEE5"/>
+              <w:right w:val="single" w:sz="4" w:color="D7DEE5"/>
+            </w:tcBorders>
           </w:tcPr>
           <w:p>
             <w:pPr>
@@ -1274,7 +1348,6 @@
               <w:bottom w:val="single" w:sz="4" w:color="D7DEE5"/>
               <w:right w:val="single" w:sz="4" w:color="D7DEE5"/>
             </w:tcBorders>
-            <w:shd w:fill="F4F7F9"/>
           </w:tcPr>
           <w:p>
             <w:pPr>
@@ -1296,7 +1369,6 @@
               <w:bottom w:val="single" w:sz="4" w:color="D7DEE5"/>
               <w:right w:val="single" w:sz="4" w:color="D7DEE5"/>
             </w:tcBorders>
-            <w:shd w:fill="F4F7F9"/>
           </w:tcPr>
           <w:p>
             <w:pPr>
@@ -1320,6 +1392,7 @@
               <w:bottom w:val="single" w:sz="4" w:color="D7DEE5"/>
               <w:right w:val="single" w:sz="4" w:color="D7DEE5"/>
             </w:tcBorders>
+            <w:shd w:fill="F4F7F9"/>
           </w:tcPr>
           <w:p>
             <w:pPr>
@@ -1348,6 +1421,7 @@
               <w:bottom w:val="single" w:sz="4" w:color="D7DEE5"/>
               <w:right w:val="single" w:sz="4" w:color="D7DEE5"/>
             </w:tcBorders>
+            <w:shd w:fill="F4F7F9"/>
           </w:tcPr>
           <w:p>
             <w:pPr>
@@ -1369,6 +1443,7 @@
               <w:bottom w:val="single" w:sz="4" w:color="D7DEE5"/>
               <w:right w:val="single" w:sz="4" w:color="D7DEE5"/>
             </w:tcBorders>
+            <w:shd w:fill="F4F7F9"/>
           </w:tcPr>
           <w:p>
             <w:pPr>
@@ -2360,6 +2435,81 @@
             </w:pPr>
             <w:r>
               <w:t xml:space="preserve">Signed in</w:t>
+            </w:r>
+          </w:p>
+        </w:tc>
+      </w:tr>
+      <w:tr>
+        <w:tc>
+          <w:tcPr>
+            <w:tcW w:type="dxa" w:w="3000"/>
+            <w:vAlign w:val="top"/>
+            <w:tcBorders>
+              <w:top w:val="single" w:sz="4" w:color="D7DEE5"/>
+              <w:left w:val="single" w:sz="4" w:color="D7DEE5"/>
+              <w:bottom w:val="single" w:sz="4" w:color="D7DEE5"/>
+              <w:right w:val="single" w:sz="4" w:color="D7DEE5"/>
+            </w:tcBorders>
+            <w:shd w:fill="F4F7F9"/>
+          </w:tcPr>
+          <w:p>
+            <w:pPr>
+              <w:pStyle w:val="TableText"/>
+              <w:spacing w:after="40"/>
+            </w:pPr>
+            <w:r>
+              <w:rPr>
+                <w:b/>
+                <w:color w:val="0E7C86"/>
+              </w:rPr>
+              <w:t xml:space="preserve">NEW v0.2  </w:t>
+            </w:r>
+            <w:r>
+              <w:t xml:space="preserve">/facilitator</w:t>
+            </w:r>
+          </w:p>
+        </w:tc>
+        <w:tc>
+          <w:tcPr>
+            <w:tcW w:type="dxa" w:w="4280"/>
+            <w:vAlign w:val="top"/>
+            <w:tcBorders>
+              <w:top w:val="single" w:sz="4" w:color="D7DEE5"/>
+              <w:left w:val="single" w:sz="4" w:color="D7DEE5"/>
+              <w:bottom w:val="single" w:sz="4" w:color="D7DEE5"/>
+              <w:right w:val="single" w:sz="4" w:color="D7DEE5"/>
+            </w:tcBorders>
+            <w:shd w:fill="F4F7F9"/>
+          </w:tcPr>
+          <w:p>
+            <w:pPr>
+              <w:pStyle w:val="TableText"/>
+              <w:spacing w:after="40"/>
+            </w:pPr>
+            <w:r>
+              <w:t xml:space="preserve">Usability-session setup: reset the device and prepare task states (prototype only; not linked, not indexed)</w:t>
+            </w:r>
+          </w:p>
+        </w:tc>
+        <w:tc>
+          <w:tcPr>
+            <w:tcW w:type="dxa" w:w="2800"/>
+            <w:vAlign w:val="top"/>
+            <w:tcBorders>
+              <w:top w:val="single" w:sz="4" w:color="D7DEE5"/>
+              <w:left w:val="single" w:sz="4" w:color="D7DEE5"/>
+              <w:bottom w:val="single" w:sz="4" w:color="D7DEE5"/>
+              <w:right w:val="single" w:sz="4" w:color="D7DEE5"/>
+            </w:tcBorders>
+            <w:shd w:fill="F4F7F9"/>
+          </w:tcPr>
+          <w:p>
+            <w:pPr>
+              <w:pStyle w:val="TableText"/>
+              <w:spacing w:after="40"/>
+            </w:pPr>
+            <w:r>
+              <w:t xml:space="preserve">Facilitator</w:t>
             </w:r>
           </w:p>
         </w:tc>
@@ -14242,6 +14392,59 @@
           </w:p>
         </w:tc>
       </w:tr>
+      <w:tr>
+        <w:tc>
+          <w:tcPr>
+            <w:tcW w:type="dxa" w:w="3000"/>
+            <w:vAlign w:val="top"/>
+            <w:tcBorders>
+              <w:top w:val="single" w:sz="4" w:color="D7DEE5"/>
+              <w:left w:val="single" w:sz="4" w:color="D7DEE5"/>
+              <w:bottom w:val="single" w:sz="4" w:color="D7DEE5"/>
+              <w:right w:val="single" w:sz="4" w:color="D7DEE5"/>
+            </w:tcBorders>
+            <w:shd w:fill="F4F7F9"/>
+          </w:tcPr>
+          <w:p>
+            <w:pPr>
+              <w:pStyle w:val="TableText"/>
+              <w:spacing w:after="40"/>
+            </w:pPr>
+            <w:r>
+              <w:rPr>
+                <w:b/>
+                <w:color w:val="0E7C86"/>
+              </w:rPr>
+              <w:t xml:space="preserve">NEW v0.2  </w:t>
+            </w:r>
+            <w:r>
+              <w:t xml:space="preserve">pnpm start --prod or usability.bat</w:t>
+            </w:r>
+          </w:p>
+        </w:tc>
+        <w:tc>
+          <w:tcPr>
+            <w:tcW w:type="dxa" w:w="7080"/>
+            <w:vAlign w:val="top"/>
+            <w:tcBorders>
+              <w:top w:val="single" w:sz="4" w:color="D7DEE5"/>
+              <w:left w:val="single" w:sz="4" w:color="D7DEE5"/>
+              <w:bottom w:val="single" w:sz="4" w:color="D7DEE5"/>
+              <w:right w:val="single" w:sz="4" w:color="D7DEE5"/>
+            </w:tcBorders>
+            <w:shd w:fill="F4F7F9"/>
+          </w:tcPr>
+          <w:p>
+            <w:pPr>
+              <w:pStyle w:val="TableText"/>
+              <w:spacing w:after="40"/>
+            </w:pPr>
+            <w:r>
+              <w:t xml:space="preserve">Builds the production app and serves it to phones on the same Wi-Fi, printing the phone and facilitator addresses</w:t>
+            </w:r>
+          </w:p>
+        </w:tc>
+      </w:tr>
     </w:tbl>
     <w:p>
       <w:r>
@@ -15471,6 +15674,18 @@
       </w:tr>
     </w:tbl>
     <w:p>
+      <w:r>
+        <w:rPr>
+          <w:b/>
+          <w:color w:val="0E7C86"/>
+        </w:rPr>
+        <w:t xml:space="preserve">NEW v0.2  </w:t>
+      </w:r>
+      <w:r>
+        <w:t xml:space="preserve">The complete kit for round 1 (script, tasks, observation sheet, SUS questionnaire and triage) is docs/MedLearn_OS_Usability_Round_1_Kit_v0_1.docx.</w:t>
+      </w:r>
+    </w:p>
+    <w:p>
       <w:pPr>
         <w:pStyle w:val="Heading1"/>
       </w:pPr>
@@ -17631,7 +17846,14 @@
               <w:spacing w:after="40"/>
             </w:pPr>
             <w:r>
-              <w:t xml:space="preserve">Icons</w:t>
+              <w:rPr>
+                <w:b/>
+                <w:color w:val="0E7C86"/>
+              </w:rPr>
+              <w:t xml:space="preserve">NEW v0.2  </w:t>
+            </w:r>
+            <w:r>
+              <w:t xml:space="preserve">Default theme</w:t>
             </w:r>
           </w:p>
         </w:tc>
@@ -17653,7 +17875,7 @@
               <w:spacing w:after="40"/>
             </w:pPr>
             <w:r>
-              <w:t xml:space="preserve">Lucide outlined SVG through one Icon wrapper; no emojis</w:t>
+              <w:t xml:space="preserve">Light is the primary theme; dark by choice (v0.1: follow the system setting)</w:t>
             </w:r>
           </w:p>
         </w:tc>
@@ -17698,7 +17920,7 @@
               <w:spacing w:after="40"/>
             </w:pPr>
             <w:r>
-              <w:t xml:space="preserve">Hosting</w:t>
+              <w:t xml:space="preserve">Icons</w:t>
             </w:r>
           </w:p>
         </w:tc>
@@ -17719,7 +17941,7 @@
               <w:spacing w:after="40"/>
             </w:pPr>
             <w:r>
-              <w:t xml:space="preserve">Vercel for the web app; Supabase cloud in the Mumbai region</w:t>
+              <w:t xml:space="preserve">Lucide outlined SVG through one Icon wrapper; no emojis</w:t>
             </w:r>
           </w:p>
         </w:tc>
@@ -17740,7 +17962,7 @@
               <w:spacing w:after="40"/>
             </w:pPr>
             <w:r>
-              <w:t xml:space="preserve">To decide</w:t>
+              <w:t xml:space="preserve">Chosen</w:t>
             </w:r>
           </w:p>
         </w:tc>
@@ -17764,7 +17986,7 @@
               <w:spacing w:after="40"/>
             </w:pPr>
             <w:r>
-              <w:t xml:space="preserve">Error monitoring</w:t>
+              <w:t xml:space="preserve">Hosting</w:t>
             </w:r>
           </w:p>
         </w:tc>
@@ -17786,7 +18008,7 @@
               <w:spacing w:after="40"/>
             </w:pPr>
             <w:r>
-              <w:t xml:space="preserve">Hosted error tracking from P1</w:t>
+              <w:t xml:space="preserve">Vercel for the web app; Supabase cloud in the Mumbai region</w:t>
             </w:r>
           </w:p>
         </w:tc>
@@ -17831,6 +18053,72 @@
               <w:spacing w:after="40"/>
             </w:pPr>
             <w:r>
+              <w:t xml:space="preserve">Error monitoring</w:t>
+            </w:r>
+          </w:p>
+        </w:tc>
+        <w:tc>
+          <w:tcPr>
+            <w:tcW w:type="dxa" w:w="5080"/>
+            <w:vAlign w:val="top"/>
+            <w:tcBorders>
+              <w:top w:val="single" w:sz="4" w:color="D7DEE5"/>
+              <w:left w:val="single" w:sz="4" w:color="D7DEE5"/>
+              <w:bottom w:val="single" w:sz="4" w:color="D7DEE5"/>
+              <w:right w:val="single" w:sz="4" w:color="D7DEE5"/>
+            </w:tcBorders>
+          </w:tcPr>
+          <w:p>
+            <w:pPr>
+              <w:pStyle w:val="TableText"/>
+              <w:spacing w:after="40"/>
+            </w:pPr>
+            <w:r>
+              <w:t xml:space="preserve">Hosted error tracking from P1</w:t>
+            </w:r>
+          </w:p>
+        </w:tc>
+        <w:tc>
+          <w:tcPr>
+            <w:tcW w:type="dxa" w:w="2400"/>
+            <w:vAlign w:val="top"/>
+            <w:tcBorders>
+              <w:top w:val="single" w:sz="4" w:color="D7DEE5"/>
+              <w:left w:val="single" w:sz="4" w:color="D7DEE5"/>
+              <w:bottom w:val="single" w:sz="4" w:color="D7DEE5"/>
+              <w:right w:val="single" w:sz="4" w:color="D7DEE5"/>
+            </w:tcBorders>
+          </w:tcPr>
+          <w:p>
+            <w:pPr>
+              <w:pStyle w:val="TableText"/>
+              <w:spacing w:after="40"/>
+            </w:pPr>
+            <w:r>
+              <w:t xml:space="preserve">To decide</w:t>
+            </w:r>
+          </w:p>
+        </w:tc>
+      </w:tr>
+      <w:tr>
+        <w:tc>
+          <w:tcPr>
+            <w:tcW w:type="dxa" w:w="2600"/>
+            <w:vAlign w:val="top"/>
+            <w:tcBorders>
+              <w:top w:val="single" w:sz="4" w:color="D7DEE5"/>
+              <w:left w:val="single" w:sz="4" w:color="D7DEE5"/>
+              <w:bottom w:val="single" w:sz="4" w:color="D7DEE5"/>
+              <w:right w:val="single" w:sz="4" w:color="D7DEE5"/>
+            </w:tcBorders>
+            <w:shd w:fill="F4F7F9"/>
+          </w:tcPr>
+          <w:p>
+            <w:pPr>
+              <w:pStyle w:val="TableText"/>
+              <w:spacing w:after="40"/>
+            </w:pPr>
+            <w:r>
               <w:t xml:space="preserve">Fonts</w:t>
             </w:r>
           </w:p>
@@ -17845,6 +18133,7 @@
               <w:bottom w:val="single" w:sz="4" w:color="D7DEE5"/>
               <w:right w:val="single" w:sz="4" w:color="D7DEE5"/>
             </w:tcBorders>
+            <w:shd w:fill="F4F7F9"/>
           </w:tcPr>
           <w:p>
             <w:pPr>
@@ -17866,6 +18155,7 @@
               <w:bottom w:val="single" w:sz="4" w:color="D7DEE5"/>
               <w:right w:val="single" w:sz="4" w:color="D7DEE5"/>
             </w:tcBorders>
+            <w:shd w:fill="F4F7F9"/>
           </w:tcPr>
           <w:p>
             <w:pPr>

</xml_diff>